<commit_message>
docs: convert doc07 formulas to LaTeX dollar-delimiter format
Co-authored-by: jissberry <jissberry@users.noreply.github.com>
</commit_message>
<xml_diff>
--- a/docs/word/07_极热无风源荷失衡与热故障耦合风险评估论文初稿.docx
+++ b/docs/word/07_极热无风源荷失衡与热故障耦合风险评估论文初稿.docx
@@ -165,7 +165,7 @@
           <w:i w:val="0"/>
           <w:sz w:val="20"/>
         </w:rPr>
-        <w:t>火电机组在高温环境下受进气密度下降、循环冷却效率降低和凝汽器背压升高等因素影响，其最大可用出力下降。对火电机组 i\in\mathcal{G}_{\mathrm{th}}，采用线性高温降容模型</w:t>
+        <w:t>火电机组在高温环境下受进气密度下降、循环冷却效率降低和凝汽器背压升高等因素影响，其最大可用出力下降。对火电机组 $i\in\mathcal{G}_{\mathrm{th}}$，采用线性高温降容模型</w:t>
       </w:r>
     </w:p>
     <w:p>
@@ -198,7 +198,7 @@
           <w:i w:val="0"/>
           <w:sz w:val="20"/>
         </w:rPr>
-        <w:t>其中，P_{G,i}^{\mathrm{rated}} 为铭牌容量，T 为环境温度，T_{\mathrm{ref}} 为额定参考温度，\alpha_i 为机组类型相关的高温降容系数，[\cdot]^+=\max(\cdot,0)。火电机组具有最小技术出力，其极热场景下的最小出力写为</w:t>
+        <w:t>其中，$P_{G,i}^{\mathrm{rated}}$ 为铭牌容量，$T$ 为环境温度，$T_{\mathrm{ref}}$ 为额定参考温度，$\alpha_i$ 为机组类型相关的高温降容系数，$[\cdot]^+=\max(\cdot,0)$。火电机组具有最小技术出力，其极热场景下的最小出力写为</w:t>
       </w:r>
     </w:p>
     <w:p>
@@ -231,7 +231,7 @@
           <w:i w:val="0"/>
           <w:sz w:val="20"/>
         </w:rPr>
-        <w:t>为避免故障场景下孤岛内“最小出力大于可消纳负荷”造成结构性不可行，本文为火电机组引入启停变量 u_i\in\{0,1\}。当 u_i=0 时机组停机且出力为零；当 u_i=1 时机组在可调度上下界内运行。</w:t>
+        <w:t>为避免故障场景下孤岛内“最小出力大于可消纳负荷”造成结构性不可行，本文为火电机组引入启停变量 $u_i\in\{0,1\}$。当 $u_i=0$ 时机组停机且出力为零；当 $u_i=1$ 时机组在可调度上下界内运行。</w:t>
       </w:r>
     </w:p>
     <w:p>
@@ -257,7 +257,7 @@
           <w:i w:val="0"/>
           <w:sz w:val="20"/>
         </w:rPr>
-        <w:t>极热事件常伴随枯水与低水头，水电可用出力以折减系数 k_{\mathrm{hy}} 表示为</w:t>
+        <w:t>极热事件常伴随枯水与低水头，水电可用出力以折减系数 $k_{\mathrm{hy}}$ 表示为</w:t>
       </w:r>
     </w:p>
     <w:p>
@@ -305,7 +305,7 @@
           <w:i w:val="0"/>
           <w:sz w:val="20"/>
         </w:rPr>
-        <w:t>风电出力由风速功率曲线决定。对风电机组 i\in\mathcal{G}_{\mathrm{w}}，其最大出力为</w:t>
+        <w:t>风电出力由风速功率曲线决定。对风电机组 $i\in\mathcal{G}_{\mathrm{w}}$，其最大出力为</w:t>
       </w:r>
     </w:p>
     <w:p>
@@ -346,7 +346,7 @@
           <w:i w:val="0"/>
           <w:sz w:val="20"/>
         </w:rPr>
-        <w:t>其中，v_{ci}、v_r 和 v_{co} 分别为切入、额定和切出风速。极热无风条件下，风速低于切入风速时风电可用出力趋近于零。</w:t>
+        <w:t>其中，$v_{ci}$、$v_r$ 和 $v_{co}$ 分别为切入、额定和切出风速。极热无风条件下，风速低于切入风速时风电可用出力趋近于零。</w:t>
       </w:r>
     </w:p>
     <w:p>
@@ -398,7 +398,7 @@
           <w:i w:val="0"/>
           <w:sz w:val="20"/>
         </w:rPr>
-        <w:t>其中，G 为太阳辐照度，G_{\mathrm{STC}} 为标准测试辐照度，\gamma 为温度功率系数，T_c 为电池温度。电池温度由环境温度和辐照度通过 NOCT 模型估计。</w:t>
+        <w:t>其中，$G$ 为太阳辐照度，$G_{\mathrm{STC}}$ 为标准测试辐照度，$\gamma$ 为温度功率系数，$T_c$ 为电池温度。电池温度由环境温度和辐照度通过 NOCT 模型估计。</w:t>
       </w:r>
     </w:p>
     <w:p>
@@ -424,7 +424,7 @@
           <w:i w:val="0"/>
           <w:sz w:val="20"/>
         </w:rPr>
-        <w:t>负荷侧将每个负荷节点的基准需求 P_{D,j}^0 分为刚性负荷和温敏负荷。设刚性比例为 \rho_{\mathrm{rigid}}，温敏比例为 \rho_{\mathrm{cool}}，则极热温度 T 下节点 j 的修正需求为</w:t>
+        <w:t>负荷侧将每个负荷节点的基准需求 $P_{D,j}^0$ 分为刚性负荷和温敏负荷。设刚性比例为 $\rho_{\mathrm{rigid}}$，温敏比例为 $\rho_{\mathrm{cool}}$，则极热温度 $T$ 下节点 $j$ 的修正需求为</w:t>
       </w:r>
     </w:p>
     <w:p>
@@ -459,7 +459,7 @@
           <w:i w:val="0"/>
           <w:sz w:val="20"/>
         </w:rPr>
-        <w:t>其中，\beta 为温度灵敏度，T_{L0} 为舒适基准温度。为反映不同负荷的重要性，本文将每个负荷节点进一步划分为一级关键负荷、二级重要负荷和三级可中断负荷，并设置差异化失负荷价值 \mathrm{VOLL}_k。第 j 个负荷节点第 k 级切负荷变量为 s_{j,k}，满足</w:t>
+        <w:t>其中，$\beta$ 为温度灵敏度，$T_{L0}$ 为舒适基准温度。为反映不同负荷的重要性，本文将每个负荷节点进一步划分为一级关键负荷、二级重要负荷和三级可中断负荷，并设置差异化失负荷价值 $\mathrm{VOLL}_k$。第 $j$ 个负荷节点第 $k$ 级切负荷变量为 $s_{j,k}$，满足</w:t>
       </w:r>
     </w:p>
     <w:p>
@@ -547,7 +547,7 @@
           <w:i w:val="0"/>
           <w:sz w:val="20"/>
         </w:rPr>
-        <w:t>基准 OPF 的决策变量包括机组有功出力 P_{G,i}、火电启停状态 u_i、节点电压相角 \theta_n 以及分级切负荷量 s_{j,k}。优化目标为发电成本和切负荷惩罚成本之和：</w:t>
+        <w:t>基准 OPF 的决策变量包括机组有功出力 $P_{G,i}$、火电启停状态 $u_i$、节点电压相角 $\theta_n$ 以及分级切负荷量 $s_{j,k}$。优化目标为发电成本和切负荷惩罚成本之和：</w:t>
       </w:r>
     </w:p>
     <w:p>
@@ -608,7 +608,7 @@
           <w:i w:val="0"/>
           <w:sz w:val="20"/>
         </w:rPr>
-        <w:t>设系统基准容量为 S_B，节点电纳矩阵为 \mathbf{B}，支路串联电纳由电抗和变比构造。节点 n 的功率平衡约束为</w:t>
+        <w:t>设系统基准容量为 $S_B$，节点电纳矩阵为 $\mathbf{B}$，支路串联电纳由电抗和变比构造。节点 $n$ 的功率平衡约束为</w:t>
       </w:r>
     </w:p>
     <w:p>
@@ -645,7 +645,7 @@
           <w:i w:val="0"/>
           <w:sz w:val="20"/>
         </w:rPr>
-        <w:t>支路 l=(m,n) 的直流潮流为</w:t>
+        <w:t>支路 $l=(m,n)$ 的直流潮流为</w:t>
       </w:r>
     </w:p>
     <w:p>
@@ -850,7 +850,7 @@
           <w:i w:val="0"/>
           <w:sz w:val="20"/>
         </w:rPr>
-        <w:t>极热无风不仅造成确定性源荷缺口，还会增加电力元件故障概率。本文在基准 OPF 得到的发电机出力、线路潮流和节点状态基础上，分别建立节点变压器、发电机和线路的故障概率模型。三类元件统一采用“应力相关故障率—评估窗口故障概率”框架。设元件在极热条件下的故障率为 \lambda，评估窗口为 \Delta t，则其故障概率为</w:t>
+        <w:t>极热无风不仅造成确定性源荷缺口，还会增加电力元件故障概率。本文在基准 OPF 得到的发电机出力、线路潮流和节点状态基础上，分别建立节点变压器、发电机和线路的故障概率模型。三类元件统一采用“应力相关故障率—评估窗口故障概率”框架。设元件在极热条件下的故障率为 $\lambda$，评估窗口为 $\Delta t$，则其故障概率为</w:t>
       </w:r>
     </w:p>
     <w:p>
@@ -942,7 +942,7 @@
           <w:i w:val="0"/>
           <w:sz w:val="20"/>
         </w:rPr>
-        <w:t>其中，\theta_a 为环境温度，\Delta\theta_{TO,R} 为额定顶层油温升，\Delta\theta_{H,R} 为额定热点对顶油温差。绝缘热老化采用 Arrhenius 加速因子</w:t>
+        <w:t>其中，$\theta_a$ 为环境温度，$\Delta\theta_{TO,R}$ 为额定顶层油温升，$\Delta\theta_{H,R}$ 为额定热点对顶油温差。绝缘热老化采用 Arrhenius 加速因子</w:t>
       </w:r>
     </w:p>
     <w:p>
@@ -1027,7 +1027,7 @@
           <w:i w:val="0"/>
           <w:sz w:val="20"/>
         </w:rPr>
-        <w:t>发电机故障概率受环境温度、有效工作温度和出力率共同影响。对机组 i，定义出力率</w:t>
+        <w:t>发电机故障概率受环境温度、有效工作温度和出力率共同影响。对机组 $i$，定义出力率</w:t>
       </w:r>
     </w:p>
     <w:p>
@@ -1115,7 +1115,7 @@
           <w:i w:val="0"/>
           <w:sz w:val="20"/>
         </w:rPr>
-        <w:t>其中，\tau(i) 表示机组类型，T_{\mathrm{eff},i} 为有效温度应力。火电、水电和风电取环境温度，光伏取电池温度，以反映光伏组件和逆变设备在高温下可靠性降低的影响。</w:t>
+        <w:t>其中，$\tau(i)$ 表示机组类型，$T_{\mathrm{eff},i}$ 为有效温度应力。火电、水电和风电取环境温度，光伏取电池温度，以反映光伏组件和逆变设备在高温下可靠性降低的影响。</w:t>
       </w:r>
     </w:p>
     <w:p>
@@ -1141,7 +1141,7 @@
           <w:i w:val="0"/>
           <w:sz w:val="20"/>
         </w:rPr>
-        <w:t>线路故障概率由线路潮流、导线电流和导线温度共同决定。基于基准 OPF 得到的支路潮流 f_l，定义负载率</w:t>
+        <w:t>线路故障概率由线路潮流、导线电流和导线温度共同决定。基于基准 OPF 得到的支路潮流 $f_l$，定义负载率</w:t>
       </w:r>
     </w:p>
     <w:p>
@@ -1172,7 +1172,7 @@
           <w:i w:val="0"/>
           <w:sz w:val="20"/>
         </w:rPr>
-        <w:t>将负载率换算为导线电流后，采用 IEEE 738 稳态热平衡计算导线温度 T_{c,l}。线路故障率采用温度应力和过载应力指数放大模型：</w:t>
+        <w:t>将负载率换算为导线电流后，采用 IEEE 738 稳态热平衡计算导线温度 $T_{c,l}$。线路故障率采用温度应力和过载应力指数放大模型：</w:t>
       </w:r>
     </w:p>
     <w:p>
@@ -1227,7 +1227,7 @@
           <w:i w:val="0"/>
           <w:sz w:val="20"/>
         </w:rPr>
-        <w:t>式中，b_T 和 b_S 分别为温度应力和过载应力系数。该模型能够反映极热、无风和强辐照条件下导线散热能力下降、导线温度升高以及过载风险增加对线路停运概率的影响。</w:t>
+        <w:t>式中，$b_T$ 和 $b_S$ 分别为温度应力和过载应力系数。该模型能够反映极热、无风和强辐照条件下导线散热能力下降、导线温度升高以及过载风险增加对线路停运概率的影响。</w:t>
       </w:r>
     </w:p>
     <w:p>
@@ -1308,7 +1308,7 @@
           <w:i w:val="0"/>
           <w:sz w:val="20"/>
         </w:rPr>
-        <w:t>其中，0 表示元件故障，1 表示元件良好，n_c=n_G+n_L+n_T。对第 i 个元件，若其故障概率为 p_i，则令</w:t>
+        <w:t>其中，$0$ 表示元件故障，$1$ 表示元件良好，$n_c=n_G+n_L+n_T$。对第 $i$ 个元件，若其故障概率为 $p_i$，则令</w:t>
       </w:r>
     </w:p>
     <w:p>
@@ -1379,9 +1379,6 @@
       </w:r>
     </w:p>
     <w:p>
-      <w:pPr>
-        <w:ind w:firstLine="0"/>
-      </w:pPr>
       <w:r>
         <w:rPr>
           <w:rFonts w:ascii="Times New Roman" w:hAnsi="Times New Roman" w:eastAsia="宋体"/>
@@ -1389,13 +1386,10 @@
           <w:i w:val="0"/>
           <w:sz w:val="20"/>
         </w:rPr>
-        <w:t>1) 若发电机 g 故障，则令 P_{G,g,s}=0。若该发电机为火电机组，则同时强制 u_{g,s}=0。</w:t>
+        <w:t>1) 若发电机 $g$ 故障，则令 $P_{G,g,s}=0$。若该发电机为火电机组，则同时强制 $u_{g,s}=0$。</w:t>
       </w:r>
     </w:p>
     <w:p>
-      <w:pPr>
-        <w:ind w:firstLine="0"/>
-      </w:pPr>
       <w:r>
         <w:rPr>
           <w:rFonts w:ascii="Times New Roman" w:hAnsi="Times New Roman" w:eastAsia="宋体"/>
@@ -1403,13 +1397,10 @@
           <w:i w:val="0"/>
           <w:sz w:val="20"/>
         </w:rPr>
-        <w:t>2) 若线路 l 故障，则该支路退出网络，其电纳不再参与 \mathbf{B}_{\mathrm{bus}} 装配。</w:t>
+        <w:t>2) 若线路 $l$ 故障，则该支路退出网络，其电纳不再参与 $\mathbf{B}_{\mathrm{bus}}$ 装配。</w:t>
       </w:r>
     </w:p>
     <w:p>
-      <w:pPr>
-        <w:ind w:firstLine="0"/>
-      </w:pPr>
       <w:r>
         <w:rPr>
           <w:rFonts w:ascii="Times New Roman" w:hAnsi="Times New Roman" w:eastAsia="宋体"/>
@@ -1417,7 +1408,7 @@
           <w:i w:val="0"/>
           <w:sz w:val="20"/>
         </w:rPr>
-        <w:t>3) 若节点变压器 t 故障，则其所在非电源节点的所有关联支路退出。令 a_{s,l} 为场景 s 中支路 l 的最终可用性，则</w:t>
+        <w:t>3) 若节点变压器 $t$ 故障，则其所在非电源节点的所有关联支路退出。令 $a_{s,l}$ 为场景 $s$ 中支路 $l$ 的最终可用性，则</w:t>
       </w:r>
     </w:p>
     <w:p>
@@ -1476,7 +1467,7 @@
           <w:i w:val="0"/>
           <w:sz w:val="20"/>
         </w:rPr>
-        <w:t>故障后 OPF 沿用式 (8)--(12) 的目标函数和网络约束，但拓扑矩阵、机组可用性和调度区间均随场景变化。与基准 OPF 不同，故障后 OPF 以基准 OPF 最优出力 P_{G,i}^{\star} 为爬坡中心。火电机组开机状态下的可调度区间为</w:t>
+        <w:t>故障后 OPF 沿用式 (8)--(12) 的目标函数和网络约束，但拓扑矩阵、机组可用性和调度区间均随场景变化。与基准 OPF 不同，故障后 OPF 以基准 OPF 最优出力 $P_{G,i}^{\star}$ 为爬坡中心。火电机组开机状态下的可调度区间为</w:t>
       </w:r>
     </w:p>
     <w:p>

</xml_diff>

<commit_message>
docs: add eight paper figures generated from computed results
Figures are produced by scripts/make_paper_figures.py directly from the
verification outputs in verify/, so they stay consistent with the model:

- fig1 method framework
- fig2 source derating and temperature-sensitive load growth
- fig3 baseline OPF dispatch versus dispatchable range
- fig4 tiered load shedding
- fig5 thermal fault probability of the three component types
- fig6 Monte Carlo scenario statistics and sampling consistency
- fig7 load shedding distribution and empirical CDF
- fig8 risk drivers behind high-shedding scenarios

Insert the figures into the paper and rebuild the Word file so it carries
both the images and native OMML equations.

Co-authored-by: jissberry <jissberry@users.noreply.github.com>
</commit_message>
<xml_diff>
--- a/docs/word/07_极热无风源荷失衡与热故障耦合风险评估论文初稿.docx
+++ b/docs/word/07_极热无风源荷失衡与热故障耦合风险评估论文初稿.docx
@@ -2,7 +2,7 @@
 <file path=word/document.xml><?xml version="1.0" encoding="utf-8"?>
 <w:document xmlns:w="http://schemas.openxmlformats.org/wordprocessingml/2006/main" xmlns:m="http://schemas.openxmlformats.org/officeDocument/2006/math" xmlns:r="http://schemas.openxmlformats.org/officeDocument/2006/relationships" xmlns:o="urn:schemas-microsoft-com:office:office" xmlns:v="urn:schemas-microsoft-com:vml" xmlns:w10="urn:schemas-microsoft-com:office:word" xmlns:a="http://schemas.openxmlformats.org/drawingml/2006/main" xmlns:pic="http://schemas.openxmlformats.org/drawingml/2006/picture" xmlns:wp="http://schemas.openxmlformats.org/drawingml/2006/wordprocessingDrawing">
   <w:body>
-    <w:bookmarkStart w:id="45" w:name="计及源荷失衡与热故障耦合的极热无风电力系统风险评估方法"/>
+    <w:bookmarkStart w:id="69" w:name="计及源荷失衡与热故障耦合的极热无风电力系统风险评估方法"/>
     <w:p>
       <w:pPr>
         <w:pStyle w:val="Heading1"/>
@@ -87,7 +87,7 @@
       </w:r>
     </w:p>
     <w:bookmarkEnd w:id="20"/>
-    <w:bookmarkStart w:id="24" w:name="ii.-极热无风条件下的源荷失衡建模"/>
+    <w:bookmarkStart w:id="30" w:name="ii.-极热无风条件下的源荷失衡建模"/>
     <w:p>
       <w:pPr>
         <w:pStyle w:val="Heading2"/>
@@ -104,7 +104,78 @@
         <w:t xml:space="preserve">极热无风事件具有典型的复合灾害特征。一方面，高温、低风速、枯水和强辐照会改变不同电源类型的可用出力上限；另一方面，高温会抬升空调等温敏负荷需求。本文将源侧降容模型和荷侧温度响应模型统一写入后续最优潮流约束，以获得极热场景下的系统基准运行状态。</w:t>
       </w:r>
     </w:p>
-    <w:bookmarkStart w:id="21" w:name="a.-火电机组高温降容模型"/>
+    <w:p>
+      <w:pPr>
+        <w:pStyle w:val="BodyText"/>
+      </w:pPr>
+      <w:r>
+        <w:t xml:space="preserve">极热无风事件具有典型的复合灾害特征。一方面，高温、低风速、枯水和强辐照会改变不同电源类型的可用出力上限；另一方面，高温会抬升空调等温敏负荷需求。本文将源侧降容模型和荷侧温度响应模型统一写入后续最优潮流约束，以获得极热场景下的系统基准运行状态。本文所提方法的总体框架如图 1 所示。</w:t>
+      </w:r>
+    </w:p>
+    <w:p>
+      <w:pPr>
+        <w:pStyle w:val="CaptionedFigure"/>
+      </w:pPr>
+      <w:r>
+        <w:drawing>
+          <wp:inline>
+            <wp:extent cx="5302908" cy="6116387"/>
+            <wp:effectExtent b="0" l="0" r="0" t="0"/>
+            <wp:docPr descr="图 1 极热无风源荷失衡与热故障耦合风险评估框架" title="" id="22" name="Picture"/>
+            <a:graphic>
+              <a:graphicData uri="http://schemas.openxmlformats.org/drawingml/2006/picture">
+                <pic:pic>
+                  <pic:nvPicPr>
+                    <pic:cNvPr descr="figures/fig1_framework.png" id="23" name="Picture"/>
+                    <pic:cNvPicPr>
+                      <a:picLocks noChangeArrowheads="1" noChangeAspect="1"/>
+                    </pic:cNvPicPr>
+                  </pic:nvPicPr>
+                  <pic:blipFill>
+                    <a:blip r:embed="rId21"/>
+                    <a:stretch>
+                      <a:fillRect/>
+                    </a:stretch>
+                  </pic:blipFill>
+                  <pic:spPr bwMode="auto">
+                    <a:xfrm>
+                      <a:off x="0" y="0"/>
+                      <a:ext cx="5302908" cy="6116387"/>
+                    </a:xfrm>
+                    <a:prstGeom prst="rect">
+                      <a:avLst/>
+                    </a:prstGeom>
+                    <a:noFill/>
+                    <a:ln w="9525">
+                      <a:noFill/>
+                      <a:headEnd/>
+                      <a:tailEnd/>
+                    </a:ln>
+                  </pic:spPr>
+                </pic:pic>
+              </a:graphicData>
+            </a:graphic>
+          </wp:inline>
+        </w:drawing>
+      </w:r>
+    </w:p>
+    <w:p>
+      <w:pPr>
+        <w:pStyle w:val="ImageCaption"/>
+      </w:pPr>
+      <w:r>
+        <w:t xml:space="preserve">图 1 极热无风源荷失衡与热故障耦合风险评估框架</w:t>
+      </w:r>
+    </w:p>
+    <w:p>
+      <w:pPr>
+        <w:pStyle w:val="BodyText"/>
+      </w:pPr>
+      <w:r>
+        <w:t xml:space="preserve">图 1　极热无风源荷失衡与热故障耦合风险评估框架</w:t>
+      </w:r>
+    </w:p>
+    <w:bookmarkStart w:id="24" w:name="a.-火电机组高温降容模型"/>
     <w:p>
       <w:pPr>
         <w:pStyle w:val="Heading3"/>
@@ -887,8 +958,8 @@
         <w:t xml:space="preserve">时机组在可调度上下界内运行。</w:t>
       </w:r>
     </w:p>
-    <w:bookmarkEnd w:id="21"/>
-    <w:bookmarkStart w:id="22" w:name="b.-水电风电和光伏出力修正模型"/>
+    <w:bookmarkEnd w:id="24"/>
+    <w:bookmarkStart w:id="25" w:name="b.-水电风电和光伏出力修正模型"/>
     <w:p>
       <w:pPr>
         <w:pStyle w:val="Heading3"/>
@@ -2026,8 +2097,8 @@
         <w:t xml:space="preserve">为电池温度。电池温度由环境温度和辐照度通过 NOCT 模型估计。</w:t>
       </w:r>
     </w:p>
-    <w:bookmarkEnd w:id="22"/>
-    <w:bookmarkStart w:id="23" w:name="c.-温敏负荷增长与分级切负荷模型"/>
+    <w:bookmarkEnd w:id="25"/>
+    <w:bookmarkStart w:id="29" w:name="c.-温敏负荷增长与分级切负荷模型"/>
     <w:p>
       <w:pPr>
         <w:pStyle w:val="Heading3"/>
@@ -2744,9 +2815,80 @@
         <w:t xml:space="preserve">该设置使最优潮流模型能够在供需缺口存在时优先保障关键负荷，并将切负荷集中于低惩罚等级负荷。</w:t>
       </w:r>
     </w:p>
-    <w:bookmarkEnd w:id="23"/>
-    <w:bookmarkEnd w:id="24"/>
-    <w:bookmarkStart w:id="28" w:name="iii.-基准运行状态的-dc-opfmiqp-模型"/>
+    <w:p>
+      <w:pPr>
+        <w:pStyle w:val="BodyText"/>
+      </w:pPr>
+      <w:r>
+        <w:t xml:space="preserve">图 2 给出了上述源侧降容模型与荷侧温敏增长模型的特性曲线。由图 2(a) 可见，燃气机组对环境温度的敏感性高于燃煤机组，水电受枯水条件影响的折减幅度最大，光伏则随电池温度升高而持续降容；由图 2(b) 可见，极热无风工况下风速低于切入风速，风电可用出力趋近于零；由图 2(c) 可见，随着温度升高，荷侧需求单调上升而源侧可用出力下降，二者共同形成显著的源荷缺口。</w:t>
+      </w:r>
+    </w:p>
+    <w:p>
+      <w:pPr>
+        <w:pStyle w:val="CaptionedFigure"/>
+      </w:pPr>
+      <w:r>
+        <w:drawing>
+          <wp:inline>
+            <wp:extent cx="5334000" cy="1766225"/>
+            <wp:effectExtent b="0" l="0" r="0" t="0"/>
+            <wp:docPr descr="图 2 极热无风条件下的源侧降容与荷侧需求增长" title="" id="27" name="Picture"/>
+            <a:graphic>
+              <a:graphicData uri="http://schemas.openxmlformats.org/drawingml/2006/picture">
+                <pic:pic>
+                  <pic:nvPicPr>
+                    <pic:cNvPr descr="figures/fig2_source_load_imbalance.png" id="28" name="Picture"/>
+                    <pic:cNvPicPr>
+                      <a:picLocks noChangeArrowheads="1" noChangeAspect="1"/>
+                    </pic:cNvPicPr>
+                  </pic:nvPicPr>
+                  <pic:blipFill>
+                    <a:blip r:embed="rId26"/>
+                    <a:stretch>
+                      <a:fillRect/>
+                    </a:stretch>
+                  </pic:blipFill>
+                  <pic:spPr bwMode="auto">
+                    <a:xfrm>
+                      <a:off x="0" y="0"/>
+                      <a:ext cx="5334000" cy="1766225"/>
+                    </a:xfrm>
+                    <a:prstGeom prst="rect">
+                      <a:avLst/>
+                    </a:prstGeom>
+                    <a:noFill/>
+                    <a:ln w="9525">
+                      <a:noFill/>
+                      <a:headEnd/>
+                      <a:tailEnd/>
+                    </a:ln>
+                  </pic:spPr>
+                </pic:pic>
+              </a:graphicData>
+            </a:graphic>
+          </wp:inline>
+        </w:drawing>
+      </w:r>
+    </w:p>
+    <w:p>
+      <w:pPr>
+        <w:pStyle w:val="ImageCaption"/>
+      </w:pPr>
+      <w:r>
+        <w:t xml:space="preserve">图 2 极热无风条件下的源侧降容与荷侧需求增长</w:t>
+      </w:r>
+    </w:p>
+    <w:p>
+      <w:pPr>
+        <w:pStyle w:val="BodyText"/>
+      </w:pPr>
+      <w:r>
+        <w:t xml:space="preserve">图 2　极热无风条件下的源侧降容与荷侧需求增长</w:t>
+      </w:r>
+    </w:p>
+    <w:bookmarkEnd w:id="29"/>
+    <w:bookmarkEnd w:id="30"/>
+    <w:bookmarkStart w:id="34" w:name="iii.-基准运行状态的-dc-opfmiqp-模型"/>
     <w:p>
       <w:pPr>
         <w:pStyle w:val="Heading2"/>
@@ -2763,7 +2905,7 @@
         <w:t xml:space="preserve">在极热无风场景下，本文首先求解无元件故障的源荷失衡基准最优潮流。由于基准 OPF 描述的是极端气象冲击后的静态运行快照，且未知上一时刻机组实际出力，基准 OPF 不施加爬坡约束；故障后 OPF 则以该基准出力为爬坡参考。</w:t>
       </w:r>
     </w:p>
-    <w:bookmarkStart w:id="25" w:name="a.-决策变量与目标函数"/>
+    <w:bookmarkStart w:id="31" w:name="a.-决策变量与目标函数"/>
     <w:p>
       <w:pPr>
         <w:pStyle w:val="Heading3"/>
@@ -3173,8 +3315,8 @@
         <w:t xml:space="preserve">由于目标函数含机组二次发电成本，且火电启停状态为二进制变量，该模型为混合整数二次规划（MIQP）。MATLAB 主实现采用 Gurobi 求解，Python 验证实现通过枚举火电启停组合并求解连续二次规划复现同一模型。</w:t>
       </w:r>
     </w:p>
-    <w:bookmarkEnd w:id="25"/>
-    <w:bookmarkStart w:id="26" w:name="b.-直流潮流约束"/>
+    <w:bookmarkEnd w:id="31"/>
+    <w:bookmarkStart w:id="32" w:name="b.-直流潮流约束"/>
     <w:p>
       <w:pPr>
         <w:pStyle w:val="Heading3"/>
@@ -3820,8 +3962,8 @@
         </m:oMath>
       </m:oMathPara>
     </w:p>
-    <w:bookmarkEnd w:id="26"/>
-    <w:bookmarkStart w:id="27" w:name="c.-源侧运行约束"/>
+    <w:bookmarkEnd w:id="32"/>
+    <w:bookmarkStart w:id="33" w:name="c.-源侧运行约束"/>
     <w:p>
       <w:pPr>
         <w:pStyle w:val="Heading3"/>
@@ -4348,9 +4490,9 @@
         <w:t xml:space="preserve">水电、风电和光伏机组均以连续变量形式参与优化，分别受式 (3)–(5) 给出的极热可用出力上限约束。风电和光伏可在可用出力范围内弃风弃光，水电受枯水可用出力和单时段能量上限约束。</w:t>
       </w:r>
     </w:p>
-    <w:bookmarkEnd w:id="27"/>
-    <w:bookmarkEnd w:id="28"/>
-    <w:bookmarkStart w:id="32" w:name="iv.-极热条件下元件热故障概率模型"/>
+    <w:bookmarkEnd w:id="33"/>
+    <w:bookmarkEnd w:id="34"/>
+    <w:bookmarkStart w:id="38" w:name="iv.-极热条件下元件热故障概率模型"/>
     <w:p>
       <w:pPr>
         <w:pStyle w:val="Heading2"/>
@@ -4468,7 +4610,7 @@
         </m:oMath>
       </m:oMathPara>
     </w:p>
-    <w:bookmarkStart w:id="29" w:name="a.-节点变压器故障概率"/>
+    <w:bookmarkStart w:id="35" w:name="a.-节点变压器故障概率"/>
     <w:p>
       <w:pPr>
         <w:pStyle w:val="Heading3"/>
@@ -5124,8 +5266,8 @@
         </m:oMath>
       </m:oMathPara>
     </w:p>
-    <w:bookmarkEnd w:id="29"/>
-    <w:bookmarkStart w:id="30" w:name="b.-发电机故障概率"/>
+    <w:bookmarkEnd w:id="35"/>
+    <w:bookmarkStart w:id="36" w:name="b.-发电机故障概率"/>
     <w:p>
       <w:pPr>
         <w:pStyle w:val="Heading3"/>
@@ -5707,8 +5849,8 @@
         <w:t xml:space="preserve">为有效温度应力。火电、水电和风电取环境温度，光伏取电池温度，以反映光伏组件和逆变设备在高温下可靠性降低的影响。</w:t>
       </w:r>
     </w:p>
-    <w:bookmarkEnd w:id="30"/>
-    <w:bookmarkStart w:id="31" w:name="c.-线路故障概率"/>
+    <w:bookmarkEnd w:id="36"/>
+    <w:bookmarkStart w:id="37" w:name="c.-线路故障概率"/>
     <w:p>
       <w:pPr>
         <w:pStyle w:val="Heading3"/>
@@ -6267,9 +6409,9 @@
         <w:t xml:space="preserve">分别为温度应力和过载应力系数。该模型能够反映极热、无风和强辐照条件下导线散热能力下降、导线温度升高以及过载风险增加对线路停运概率的影响。</w:t>
       </w:r>
     </w:p>
-    <w:bookmarkEnd w:id="31"/>
-    <w:bookmarkEnd w:id="32"/>
-    <w:bookmarkStart w:id="36" w:name="v.-蒙特卡洛故障场景与故障后-opf-遍历"/>
+    <w:bookmarkEnd w:id="37"/>
+    <w:bookmarkEnd w:id="38"/>
+    <w:bookmarkStart w:id="42" w:name="v.-蒙特卡洛故障场景与故障后-opf-遍历"/>
     <w:p>
       <w:pPr>
         <w:pStyle w:val="Heading2"/>
@@ -6278,7 +6420,7 @@
         <w:t xml:space="preserve">V. 蒙特卡洛故障场景与故障后 OPF 遍历</w:t>
       </w:r>
     </w:p>
-    <w:bookmarkStart w:id="33" w:name="a.-故障场景抽样"/>
+    <w:bookmarkStart w:id="39" w:name="a.-故障场景抽样"/>
     <w:p>
       <w:pPr>
         <w:pStyle w:val="Heading3"/>
@@ -7081,8 +7223,8 @@
         <w:t xml:space="preserve">该场景集可用于后续故障后 OPF、失负荷统计和系统风险分布估计。</w:t>
       </w:r>
     </w:p>
-    <w:bookmarkEnd w:id="33"/>
-    <w:bookmarkStart w:id="34" w:name="b.-故障映射规则"/>
+    <w:bookmarkEnd w:id="39"/>
+    <w:bookmarkStart w:id="40" w:name="b.-故障映射规则"/>
     <w:p>
       <w:pPr>
         <w:pStyle w:val="Heading3"/>
@@ -7563,8 +7705,8 @@
         <w:t xml:space="preserve">该映射将节点变压器故障转化为相关支路的拓扑退出，从而在 DC-OPF 中刻画节点供电通道受损的影响。</w:t>
       </w:r>
     </w:p>
-    <w:bookmarkEnd w:id="34"/>
-    <w:bookmarkStart w:id="35" w:name="c.-故障后-opf-模型"/>
+    <w:bookmarkEnd w:id="40"/>
+    <w:bookmarkStart w:id="41" w:name="c.-故障后-opf-模型"/>
     <w:p>
       <w:pPr>
         <w:pStyle w:val="Heading3"/>
@@ -8335,9 +8477,9 @@
         <w:t xml:space="preserve">水电机组不设置启停变量，但在故障后 OPF 中按基准水电出力施加爬坡区间。引入火电启停变量后，若网络故障导致局部孤岛负荷不足，火电机组可通过停机避免最小出力约束造成不可行，从而提高故障后 OPF 的可解性。</w:t>
       </w:r>
     </w:p>
-    <w:bookmarkEnd w:id="35"/>
-    <w:bookmarkEnd w:id="36"/>
-    <w:bookmarkStart w:id="42" w:name="vi.-算例设置与结果分析"/>
+    <w:bookmarkEnd w:id="41"/>
+    <w:bookmarkEnd w:id="42"/>
+    <w:bookmarkStart w:id="66" w:name="vi.-算例设置与结果分析"/>
     <w:p>
       <w:pPr>
         <w:pStyle w:val="Heading2"/>
@@ -8346,7 +8488,7 @@
         <w:t xml:space="preserve">VI. 算例设置与结果分析</w:t>
       </w:r>
     </w:p>
-    <w:bookmarkStart w:id="37" w:name="a.-修改版-ieee-39-节点系统"/>
+    <w:bookmarkStart w:id="43" w:name="a.-修改版-ieee-39-节点系统"/>
     <w:p>
       <w:pPr>
         <w:pStyle w:val="Heading3"/>
@@ -8606,8 +8748,8 @@
         </w:tc>
       </w:tr>
     </w:tbl>
-    <w:bookmarkEnd w:id="37"/>
-    <w:bookmarkStart w:id="38" w:name="b.-基准-opf-结果"/>
+    <w:bookmarkEnd w:id="43"/>
+    <w:bookmarkStart w:id="50" w:name="b.-基准-opf-结果"/>
     <w:p>
       <w:pPr>
         <w:pStyle w:val="Heading3"/>
@@ -8984,8 +9126,150 @@
         <w:t xml:space="preserve">从机组出力看，水电、光伏和多数火电机组接近或达到极热修正后的可用上限，风电出力为零，表明系统在该场景下已处于源侧能力紧张状态。基准 OPF 不施加爬坡约束，火电调度下界取最小技术出力；故障后分析再以该基准出力作为爬坡中心。</w:t>
       </w:r>
     </w:p>
-    <w:bookmarkEnd w:id="38"/>
-    <w:bookmarkStart w:id="39" w:name="c.-故障概率与蒙特卡洛场景"/>
+    <w:p>
+      <w:pPr>
+        <w:pStyle w:val="BodyText"/>
+      </w:pPr>
+      <w:r>
+        <w:t xml:space="preserve">基准 OPF 的机组调度结果如图 3 所示。由图 3(a) 可见，除受网络安全约束限制的燃气机组外，其余可调机组均运行在极热修正后的调度上界附近；由图 3(b) 可见，四类电源中风电可用出力降至零，光伏与水电分别折减至约 74% 和 85%，火电降容幅度相对较小。</w:t>
+      </w:r>
+    </w:p>
+    <w:p>
+      <w:pPr>
+        <w:pStyle w:val="CaptionedFigure"/>
+      </w:pPr>
+      <w:r>
+        <w:drawing>
+          <wp:inline>
+            <wp:extent cx="5334000" cy="1937953"/>
+            <wp:effectExtent b="0" l="0" r="0" t="0"/>
+            <wp:docPr descr="图 3 极热无风基准 OPF 调度结果" title="" id="45" name="Picture"/>
+            <a:graphic>
+              <a:graphicData uri="http://schemas.openxmlformats.org/drawingml/2006/picture">
+                <pic:pic>
+                  <pic:nvPicPr>
+                    <pic:cNvPr descr="figures/fig3_baseline_dispatch.png" id="46" name="Picture"/>
+                    <pic:cNvPicPr>
+                      <a:picLocks noChangeArrowheads="1" noChangeAspect="1"/>
+                    </pic:cNvPicPr>
+                  </pic:nvPicPr>
+                  <pic:blipFill>
+                    <a:blip r:embed="rId44"/>
+                    <a:stretch>
+                      <a:fillRect/>
+                    </a:stretch>
+                  </pic:blipFill>
+                  <pic:spPr bwMode="auto">
+                    <a:xfrm>
+                      <a:off x="0" y="0"/>
+                      <a:ext cx="5334000" cy="1937953"/>
+                    </a:xfrm>
+                    <a:prstGeom prst="rect">
+                      <a:avLst/>
+                    </a:prstGeom>
+                    <a:noFill/>
+                    <a:ln w="9525">
+                      <a:noFill/>
+                      <a:headEnd/>
+                      <a:tailEnd/>
+                    </a:ln>
+                  </pic:spPr>
+                </pic:pic>
+              </a:graphicData>
+            </a:graphic>
+          </wp:inline>
+        </w:drawing>
+      </w:r>
+    </w:p>
+    <w:p>
+      <w:pPr>
+        <w:pStyle w:val="ImageCaption"/>
+      </w:pPr>
+      <w:r>
+        <w:t xml:space="preserve">图 3 极热无风基准 OPF 调度结果</w:t>
+      </w:r>
+    </w:p>
+    <w:p>
+      <w:pPr>
+        <w:pStyle w:val="BodyText"/>
+      </w:pPr>
+      <w:r>
+        <w:t xml:space="preserve">图 3　极热无风基准 OPF 调度结果</w:t>
+      </w:r>
+    </w:p>
+    <w:p>
+      <w:pPr>
+        <w:pStyle w:val="BodyText"/>
+      </w:pPr>
+      <w:r>
+        <w:t xml:space="preserve">基准 OPF 的切负荷分布如图 4 所示。由图 4(a) 可见，切负荷分散于各负荷节点，且均来自三级可中断负荷；由图 4(b) 可见，一级和二级负荷切除量均为零，验证了分级惩罚机制对关键负荷的保障作用。</w:t>
+      </w:r>
+    </w:p>
+    <w:p>
+      <w:pPr>
+        <w:pStyle w:val="CaptionedFigure"/>
+      </w:pPr>
+      <w:r>
+        <w:drawing>
+          <wp:inline>
+            <wp:extent cx="5334000" cy="1835028"/>
+            <wp:effectExtent b="0" l="0" r="0" t="0"/>
+            <wp:docPr descr="图 4 基准 OPF 的分级切负荷结果" title="" id="48" name="Picture"/>
+            <a:graphic>
+              <a:graphicData uri="http://schemas.openxmlformats.org/drawingml/2006/picture">
+                <pic:pic>
+                  <pic:nvPicPr>
+                    <pic:cNvPr descr="figures/fig4_load_shedding.png" id="49" name="Picture"/>
+                    <pic:cNvPicPr>
+                      <a:picLocks noChangeArrowheads="1" noChangeAspect="1"/>
+                    </pic:cNvPicPr>
+                  </pic:nvPicPr>
+                  <pic:blipFill>
+                    <a:blip r:embed="rId47"/>
+                    <a:stretch>
+                      <a:fillRect/>
+                    </a:stretch>
+                  </pic:blipFill>
+                  <pic:spPr bwMode="auto">
+                    <a:xfrm>
+                      <a:off x="0" y="0"/>
+                      <a:ext cx="5334000" cy="1835028"/>
+                    </a:xfrm>
+                    <a:prstGeom prst="rect">
+                      <a:avLst/>
+                    </a:prstGeom>
+                    <a:noFill/>
+                    <a:ln w="9525">
+                      <a:noFill/>
+                      <a:headEnd/>
+                      <a:tailEnd/>
+                    </a:ln>
+                  </pic:spPr>
+                </pic:pic>
+              </a:graphicData>
+            </a:graphic>
+          </wp:inline>
+        </w:drawing>
+      </w:r>
+    </w:p>
+    <w:p>
+      <w:pPr>
+        <w:pStyle w:val="ImageCaption"/>
+      </w:pPr>
+      <w:r>
+        <w:t xml:space="preserve">图 4 基准 OPF 的分级切负荷结果</w:t>
+      </w:r>
+    </w:p>
+    <w:p>
+      <w:pPr>
+        <w:pStyle w:val="BodyText"/>
+      </w:pPr>
+      <w:r>
+        <w:t xml:space="preserve">图 4　基准 OPF 的分级切负荷结果</w:t>
+      </w:r>
+    </w:p>
+    <w:bookmarkEnd w:id="50"/>
+    <w:bookmarkStart w:id="57" w:name="c.-故障概率与蒙特卡洛场景"/>
     <w:p>
       <w:pPr>
         <w:pStyle w:val="Heading3"/>
@@ -9271,8 +9555,150 @@
         </w:tc>
       </w:tr>
     </w:tbl>
-    <w:bookmarkEnd w:id="39"/>
-    <w:bookmarkStart w:id="40" w:name="d.-故障后-opf-遍历结果"/>
+    <w:p>
+      <w:pPr>
+        <w:pStyle w:val="BodyText"/>
+      </w:pPr>
+      <w:r>
+        <w:t xml:space="preserve">三类元件的故障概率计算结果如图 5 所示。由图 5(a) 可见，燃气机组因温度敏感系数较大且出力率较高，故障概率明显高于其他机组；由图 5(b) 可见，线路故障概率随负载率升高而显著上升，满载断面对应的导线温度已超过连续运行温度限值；由图 5(c) 可见，发电机故障概率整体高于线路和节点变压器，是本算例中主导的故障来源。</w:t>
+      </w:r>
+    </w:p>
+    <w:p>
+      <w:pPr>
+        <w:pStyle w:val="CaptionedFigure"/>
+      </w:pPr>
+      <w:r>
+        <w:drawing>
+          <wp:inline>
+            <wp:extent cx="5334000" cy="1713353"/>
+            <wp:effectExtent b="0" l="0" r="0" t="0"/>
+            <wp:docPr descr="图 5 极热条件下三类元件的热故障概率" title="" id="52" name="Picture"/>
+            <a:graphic>
+              <a:graphicData uri="http://schemas.openxmlformats.org/drawingml/2006/picture">
+                <pic:pic>
+                  <pic:nvPicPr>
+                    <pic:cNvPr descr="figures/fig5_fault_probability.png" id="53" name="Picture"/>
+                    <pic:cNvPicPr>
+                      <a:picLocks noChangeArrowheads="1" noChangeAspect="1"/>
+                    </pic:cNvPicPr>
+                  </pic:nvPicPr>
+                  <pic:blipFill>
+                    <a:blip r:embed="rId51"/>
+                    <a:stretch>
+                      <a:fillRect/>
+                    </a:stretch>
+                  </pic:blipFill>
+                  <pic:spPr bwMode="auto">
+                    <a:xfrm>
+                      <a:off x="0" y="0"/>
+                      <a:ext cx="5334000" cy="1713353"/>
+                    </a:xfrm>
+                    <a:prstGeom prst="rect">
+                      <a:avLst/>
+                    </a:prstGeom>
+                    <a:noFill/>
+                    <a:ln w="9525">
+                      <a:noFill/>
+                      <a:headEnd/>
+                      <a:tailEnd/>
+                    </a:ln>
+                  </pic:spPr>
+                </pic:pic>
+              </a:graphicData>
+            </a:graphic>
+          </wp:inline>
+        </w:drawing>
+      </w:r>
+    </w:p>
+    <w:p>
+      <w:pPr>
+        <w:pStyle w:val="ImageCaption"/>
+      </w:pPr>
+      <w:r>
+        <w:t xml:space="preserve">图 5 极热条件下三类元件的热故障概率</w:t>
+      </w:r>
+    </w:p>
+    <w:p>
+      <w:pPr>
+        <w:pStyle w:val="BodyText"/>
+      </w:pPr>
+      <w:r>
+        <w:t xml:space="preserve">图 5　极热条件下三类元件的热故障概率</w:t>
+      </w:r>
+    </w:p>
+    <w:p>
+      <w:pPr>
+        <w:pStyle w:val="BodyText"/>
+      </w:pPr>
+      <w:r>
+        <w:t xml:space="preserve">蒙特卡洛抽样结果如图 6 所示。由图 6(a) 可见，约 68.5% 的场景不含故障元件，含单一故障的场景占 26.6%，多重故障场景占比较小但构成尾部风险的主要来源；由图 6(b) 可见，发电机故障事件占全部故障事件的 70.2%；由图 6(c) 可见，各元件的抽样经验频率与理论故障概率基本吻合，验证了抽样过程的正确性。</w:t>
+      </w:r>
+    </w:p>
+    <w:p>
+      <w:pPr>
+        <w:pStyle w:val="CaptionedFigure"/>
+      </w:pPr>
+      <w:r>
+        <w:drawing>
+          <wp:inline>
+            <wp:extent cx="5334000" cy="1714643"/>
+            <wp:effectExtent b="0" l="0" r="0" t="0"/>
+            <wp:docPr descr="图 6 蒙特卡洛故障场景抽样结果" title="" id="55" name="Picture"/>
+            <a:graphic>
+              <a:graphicData uri="http://schemas.openxmlformats.org/drawingml/2006/picture">
+                <pic:pic>
+                  <pic:nvPicPr>
+                    <pic:cNvPr descr="figures/fig6_monte_carlo.png" id="56" name="Picture"/>
+                    <pic:cNvPicPr>
+                      <a:picLocks noChangeArrowheads="1" noChangeAspect="1"/>
+                    </pic:cNvPicPr>
+                  </pic:nvPicPr>
+                  <pic:blipFill>
+                    <a:blip r:embed="rId54"/>
+                    <a:stretch>
+                      <a:fillRect/>
+                    </a:stretch>
+                  </pic:blipFill>
+                  <pic:spPr bwMode="auto">
+                    <a:xfrm>
+                      <a:off x="0" y="0"/>
+                      <a:ext cx="5334000" cy="1714643"/>
+                    </a:xfrm>
+                    <a:prstGeom prst="rect">
+                      <a:avLst/>
+                    </a:prstGeom>
+                    <a:noFill/>
+                    <a:ln w="9525">
+                      <a:noFill/>
+                      <a:headEnd/>
+                      <a:tailEnd/>
+                    </a:ln>
+                  </pic:spPr>
+                </pic:pic>
+              </a:graphicData>
+            </a:graphic>
+          </wp:inline>
+        </w:drawing>
+      </w:r>
+    </w:p>
+    <w:p>
+      <w:pPr>
+        <w:pStyle w:val="ImageCaption"/>
+      </w:pPr>
+      <w:r>
+        <w:t xml:space="preserve">图 6 蒙特卡洛故障场景抽样结果</w:t>
+      </w:r>
+    </w:p>
+    <w:p>
+      <w:pPr>
+        <w:pStyle w:val="BodyText"/>
+      </w:pPr>
+      <w:r>
+        <w:t xml:space="preserve">图 6　蒙特卡洛故障场景抽样结果（2000 × 85）</w:t>
+      </w:r>
+    </w:p>
+    <w:bookmarkEnd w:id="57"/>
+    <w:bookmarkStart w:id="64" w:name="d.-故障后-opf-遍历结果"/>
     <w:p>
       <w:pPr>
         <w:pStyle w:val="Heading3"/>
@@ -9781,8 +10207,150 @@
         <w:t xml:space="preserve">结果表明，多数场景未显著增加基准切负荷，但高分位和最大值场景显示出显著尾部风险。高切负荷场景主要由大容量火电机组故障或停机、关键支路退出以及节点变压器故障引发的网络可达性下降共同造成。统计中共有 388 个场景出现至少一台火电关停，包括故障强制停机和孤岛安全停机。这说明火电启停变量不仅是求解可行性的技术处理，也反映了极端故障后系统运行方式的必要调整。</w:t>
       </w:r>
     </w:p>
-    <w:bookmarkEnd w:id="40"/>
-    <w:bookmarkStart w:id="41" w:name="e.-交叉验证与实现一致性"/>
+    <w:p>
+      <w:pPr>
+        <w:pStyle w:val="BodyText"/>
+      </w:pPr>
+      <w:r>
+        <w:t xml:space="preserve">切负荷的统计分布如图 7 所示。由图 7(a) 可见，切负荷呈明显的右偏分布，大量场景集中于基准切负荷附近，而少数场景切负荷显著增大；由图 7(b) 可见，经验累积分布在约 75% 分位处出现明显拐点，此后曲线迅速右移，表明系统风险主要集中在分布尾部；由图 7(c) 可见，90% 分位以上场景的故障新增切负荷已超过基准切负荷本身。</w:t>
+      </w:r>
+    </w:p>
+    <w:p>
+      <w:pPr>
+        <w:pStyle w:val="CaptionedFigure"/>
+      </w:pPr>
+      <w:r>
+        <w:drawing>
+          <wp:inline>
+            <wp:extent cx="5334000" cy="1728806"/>
+            <wp:effectExtent b="0" l="0" r="0" t="0"/>
+            <wp:docPr descr="图 7 2000 个热故障场景的切负荷分布" title="" id="59" name="Picture"/>
+            <a:graphic>
+              <a:graphicData uri="http://schemas.openxmlformats.org/drawingml/2006/picture">
+                <pic:pic>
+                  <pic:nvPicPr>
+                    <pic:cNvPr descr="figures/fig7_shedding_distribution.png" id="60" name="Picture"/>
+                    <pic:cNvPicPr>
+                      <a:picLocks noChangeArrowheads="1" noChangeAspect="1"/>
+                    </pic:cNvPicPr>
+                  </pic:nvPicPr>
+                  <pic:blipFill>
+                    <a:blip r:embed="rId58"/>
+                    <a:stretch>
+                      <a:fillRect/>
+                    </a:stretch>
+                  </pic:blipFill>
+                  <pic:spPr bwMode="auto">
+                    <a:xfrm>
+                      <a:off x="0" y="0"/>
+                      <a:ext cx="5334000" cy="1728806"/>
+                    </a:xfrm>
+                    <a:prstGeom prst="rect">
+                      <a:avLst/>
+                    </a:prstGeom>
+                    <a:noFill/>
+                    <a:ln w="9525">
+                      <a:noFill/>
+                      <a:headEnd/>
+                      <a:tailEnd/>
+                    </a:ln>
+                  </pic:spPr>
+                </pic:pic>
+              </a:graphicData>
+            </a:graphic>
+          </wp:inline>
+        </w:drawing>
+      </w:r>
+    </w:p>
+    <w:p>
+      <w:pPr>
+        <w:pStyle w:val="ImageCaption"/>
+      </w:pPr>
+      <w:r>
+        <w:t xml:space="preserve">图 7 2000 个热故障场景的切负荷分布</w:t>
+      </w:r>
+    </w:p>
+    <w:p>
+      <w:pPr>
+        <w:pStyle w:val="BodyText"/>
+      </w:pPr>
+      <w:r>
+        <w:t xml:space="preserve">图 7　2000 个热故障场景的切负荷分布</w:t>
+      </w:r>
+    </w:p>
+    <w:p>
+      <w:pPr>
+        <w:pStyle w:val="BodyText"/>
+      </w:pPr>
+      <w:r>
+        <w:t xml:space="preserve">为进一步识别风险主导因素，图 8 给出了切负荷与故障构成之间的关系。由图 8(a) 可见，切负荷随故障发电机台数增加而单调上升，三台机组同时故障时切负荷中位数接近 2900 MW；由图 8(b) 可见，网络类故障在引发火电停机时会进一步放大切负荷；由图 8(c) 可见，电源故障对切负荷的影响强于单纯的网络故障，而电源与网络故障同时发生的场景对应最高的切负荷水平。</w:t>
+      </w:r>
+    </w:p>
+    <w:p>
+      <w:pPr>
+        <w:pStyle w:val="CaptionedFigure"/>
+      </w:pPr>
+      <w:r>
+        <w:drawing>
+          <wp:inline>
+            <wp:extent cx="5334000" cy="1729660"/>
+            <wp:effectExtent b="0" l="0" r="0" t="0"/>
+            <wp:docPr descr="图 8 切负荷风险的主导因素分析" title="" id="62" name="Picture"/>
+            <a:graphic>
+              <a:graphicData uri="http://schemas.openxmlformats.org/drawingml/2006/picture">
+                <pic:pic>
+                  <pic:nvPicPr>
+                    <pic:cNvPr descr="figures/fig8_risk_drivers.png" id="63" name="Picture"/>
+                    <pic:cNvPicPr>
+                      <a:picLocks noChangeArrowheads="1" noChangeAspect="1"/>
+                    </pic:cNvPicPr>
+                  </pic:nvPicPr>
+                  <pic:blipFill>
+                    <a:blip r:embed="rId61"/>
+                    <a:stretch>
+                      <a:fillRect/>
+                    </a:stretch>
+                  </pic:blipFill>
+                  <pic:spPr bwMode="auto">
+                    <a:xfrm>
+                      <a:off x="0" y="0"/>
+                      <a:ext cx="5334000" cy="1729660"/>
+                    </a:xfrm>
+                    <a:prstGeom prst="rect">
+                      <a:avLst/>
+                    </a:prstGeom>
+                    <a:noFill/>
+                    <a:ln w="9525">
+                      <a:noFill/>
+                      <a:headEnd/>
+                      <a:tailEnd/>
+                    </a:ln>
+                  </pic:spPr>
+                </pic:pic>
+              </a:graphicData>
+            </a:graphic>
+          </wp:inline>
+        </w:drawing>
+      </w:r>
+    </w:p>
+    <w:p>
+      <w:pPr>
+        <w:pStyle w:val="ImageCaption"/>
+      </w:pPr>
+      <w:r>
+        <w:t xml:space="preserve">图 8 切负荷风险的主导因素分析</w:t>
+      </w:r>
+    </w:p>
+    <w:p>
+      <w:pPr>
+        <w:pStyle w:val="BodyText"/>
+      </w:pPr>
+      <w:r>
+        <w:t xml:space="preserve">图 8　切负荷风险的主导因素分析</w:t>
+      </w:r>
+    </w:p>
+    <w:bookmarkEnd w:id="64"/>
+    <w:bookmarkStart w:id="65" w:name="e.-交叉验证与实现一致性"/>
     <w:p>
       <w:pPr>
         <w:pStyle w:val="Heading3"/>
@@ -9799,9 +10367,9 @@
         <w:t xml:space="preserve">本文同时给出 MATLAB/Gurobi 主实现和 Python 开源验证实现。MATLAB 版本负责模型装配和 MIQP 求解，Python 版本通过枚举火电启停组合并求解连续二次规划复现同一优化模型；矩阵形式验证脚本进一步逐元素对比 Gurobi 标准型装配。基准 OPF、故障概率、蒙特卡洛场景和故障后 OPF 的结果文件均由脚本生成，保证了算例流程的可复现性。</w:t>
       </w:r>
     </w:p>
-    <w:bookmarkEnd w:id="41"/>
-    <w:bookmarkEnd w:id="42"/>
-    <w:bookmarkStart w:id="43" w:name="vii.-结论"/>
+    <w:bookmarkEnd w:id="65"/>
+    <w:bookmarkEnd w:id="66"/>
+    <w:bookmarkStart w:id="67" w:name="vii.-结论"/>
     <w:p>
       <w:pPr>
         <w:pStyle w:val="Heading2"/>
@@ -9834,8 +10402,8 @@
         <w:t xml:space="preserve">后续研究可进一步从以下方面拓展：一是引入交流潮流模型以更准确刻画电压、无功和变压器视在负载；二是考虑时序多阶段调度、储能和需求响应对极热风险的缓解作用；三是将实际气象场、设备状态和运维数据融入故障概率参数辨识，以增强模型在实际电网中的适用性。</w:t>
       </w:r>
     </w:p>
-    <w:bookmarkEnd w:id="43"/>
-    <w:bookmarkStart w:id="44" w:name="参考文献"/>
+    <w:bookmarkEnd w:id="67"/>
+    <w:bookmarkStart w:id="68" w:name="参考文献"/>
     <w:p>
       <w:pPr>
         <w:pStyle w:val="Heading2"/>
@@ -10597,8 +11165,8 @@
         <w:t xml:space="preserve">, vol. 10, no. 7, pp. 1582-1588, 2016.</w:t>
       </w:r>
     </w:p>
-    <w:bookmarkEnd w:id="44"/>
-    <w:bookmarkEnd w:id="45"/>
+    <w:bookmarkEnd w:id="68"/>
+    <w:bookmarkEnd w:id="69"/>
     <w:sectPr/>
   </w:body>
 </w:document>

</xml_diff>